<commit_message>
모든 md, pdf, docx 문서에서 '15.164.190.193' 문자열을 'teskim-vibecoding.ddns.net' 로 수정
</commit_message>
<xml_diff>
--- a/USER_GUIDE.docx
+++ b/USER_GUIDE.docx
@@ -2,32 +2,14 @@
 <file path=word/document.xml><?xml version="1.0" encoding="utf-8"?>
 <w:document xmlns:w="http://schemas.openxmlformats.org/wordprocessingml/2006/main" xmlns:m="http://schemas.openxmlformats.org/officeDocument/2006/math" xmlns:r="http://schemas.openxmlformats.org/officeDocument/2006/relationships" xmlns:o="urn:schemas-microsoft-com:office:office" xmlns:v="urn:schemas-microsoft-com:vml" xmlns:w10="urn:schemas-microsoft-com:office:word" xmlns:a="http://schemas.openxmlformats.org/drawingml/2006/main" xmlns:pic="http://schemas.openxmlformats.org/drawingml/2006/picture" xmlns:wp="http://schemas.openxmlformats.org/drawingml/2006/wordprocessingDrawing">
   <w:body>
-    <w:sdt>
-      <w:sdtPr>
-        <w:docPartObj>
-          <w:docPartGallery w:val="Table of Contents"/>
-          <w:docPartUnique/>
-        </w:docPartObj>
-      </w:sdtPr>
-      <w:sdtContent>
-        <w:p>
-          <w:pPr>
-            <w:pStyle w:val="TOCHeading"/>
-          </w:pPr>
-          <w:r>
-            <w:t xml:space="preserve">Table of Contents</w:t>
-          </w:r>
-        </w:p>
-        <w:p>
-          <w:r>
-            <w:fldChar w:fldCharType="begin" w:dirty="true"/>
-            <w:instrText xml:space="preserve">TOC \o "1-2" \h \z \u</w:instrText>
-            <w:fldChar w:fldCharType="separate"/>
-            <w:fldChar w:fldCharType="end"/>
-          </w:r>
-        </w:p>
-      </w:sdtContent>
-    </w:sdt>
+    <w:p>
+      <w:pPr>
+        <w:pStyle w:val="Title"/>
+      </w:pPr>
+      <w:r>
+        <w:t xml:space="preserve">Java SAST 도구 사용 가이드</w:t>
+      </w:r>
+    </w:p>
     <w:bookmarkStart w:id="49" w:name="java-sast-engine-사용자-가이드"/>
     <w:p>
       <w:pPr>
@@ -1416,7 +1398,7 @@
         <w:rPr>
           <w:rStyle w:val="VerbatimChar"/>
         </w:rPr>
-        <w:t xml:space="preserve">http://15.164.190.193:5000</w:t>
+        <w:t xml:space="preserve">http://teskim-vibecoding.ddns.net:5000</w:t>
       </w:r>
       <w:r>
         <w:t xml:space="preserve"> </w:t>
@@ -2331,7 +2313,7 @@
         <w:rPr>
           <w:rStyle w:val="VerbatimChar"/>
         </w:rPr>
-        <w:t xml:space="preserve">http://15.164.190.193:5000</w:t>
+        <w:t xml:space="preserve">http://teskim-vibecoding.ddns.net:5000</w:t>
       </w:r>
       <w:r>
         <w:t xml:space="preserve"> </w:t>

</xml_diff>